<commit_message>
Fix punctuation in v1.6.md and AUDIT-TRAIL.md; refresh hashes and archive after user edits (Apr 12)
</commit_message>
<xml_diff>
--- a/Cognitive Amplification Essay/v1.6/Cognitive Amplification-A Framework for Human-AI Collaborative Authorship v1.6 AUDIT-TRAIL.docx
+++ b/Cognitive Amplification Essay/v1.6/Cognitive Amplification-A Framework for Human-AI Collaborative Authorship v1.6 AUDIT-TRAIL.docx
@@ -14,8 +14,6 @@
       <w:pPr>
         <w:pStyle w:val="Metadata"/>
       </w:pPr>
-      <w:bookmarkStart w:id="0" w:name="_GoBack"/>
-      <w:bookmarkEnd w:id="0"/>
       <w:r>
         <w:t>Preprint - v1.6 (April 2026)</w:t>
       </w:r>
@@ -28,7 +26,7 @@
       <w:r>
         <w:br/>
       </w:r>
-      <w:bookmarkStart w:id="1" w:name="_Hlk226801288"/>
+      <w:bookmarkStart w:id="0" w:name="_Hlk226801288"/>
       <w:r>
         <w:pict>
           <v:rect id="_x0000_i1025" style="width:0;height:1.5pt" o:hralign="center" o:hrstd="t" o:hr="t"/>
@@ -157,6 +155,25 @@
           <w:t>DOI: 10.5281/zenodo.19423182</w:t>
         </w:r>
       </w:hyperlink>
+      <w:r>
+        <w:rPr>
+          <w:color w:val="4F81BD"/>
+        </w:rPr>
+        <w:t xml:space="preserve">. </w:t>
+      </w:r>
+      <w:r>
+        <w:t>(</w:t>
+      </w:r>
+      <w:r>
+        <w:rPr>
+          <w:b/>
+          <w:bCs/>
+        </w:rPr>
+        <w:t>reserved; will resolve upon public release</w:t>
+      </w:r>
+      <w:r>
+        <w:t>).</w:t>
+      </w:r>
     </w:p>
     <w:p>
       <w:r>
@@ -165,7 +182,7 @@
         </w:pict>
       </w:r>
     </w:p>
-    <w:bookmarkEnd w:id="1"/>
+    <w:bookmarkEnd w:id="0"/>
     <w:p>
       <w:pPr>
         <w:pStyle w:val="Heading1"/>
@@ -176,7 +193,12 @@
     </w:p>
     <w:p>
       <w:r>
-        <w:t>This document is the public release version of the essay's production log. What it proves is not just that the essay changed many times, but that the pattern of change remained consistent throughout: the human identified the problem, AI implemented against that direction, the human evaluated the result, and the human redirected when the work still was not right. The essay argues that this is what cognitive amplification looks like in practice. The audit trail shows the method operating on the essay itself.</w:t>
+        <w:t>This document is th</w:t>
+      </w:r>
+      <w:bookmarkStart w:id="1" w:name="_GoBack"/>
+      <w:bookmarkEnd w:id="1"/>
+      <w:r>
+        <w:t>e public release version of the essay's production log. What it proves is not just that the essay changed many times, but that the pattern of change remained consistent throughout: the human identified the problem, AI implemented against that direction, the human evaluated the result, and the human redirected when the work still was not right. The essay argues that this is what cognitive amplification looks like in practice. The audit trail shows the method operating on the essay itself.</w:t>
       </w:r>
     </w:p>
     <w:p>
@@ -8006,6 +8028,7 @@
           <w:b/>
           <w:bCs/>
         </w:rPr>
+        <w:lastRenderedPageBreak/>
         <w:t>Advisory chain for this pass:</w:t>
       </w:r>
       <w:r>
@@ -8210,6 +8233,7 @@
           <w:b/>
           <w:bCs/>
         </w:rPr>
+        <w:lastRenderedPageBreak/>
         <w:t>Research grounded in human-sourced material</w:t>
       </w:r>
       <w:r>
@@ -8353,7 +8377,11 @@
         <w:t>Problem Identified in v0.12:</w:t>
       </w:r>
       <w:r>
-        <w:t xml:space="preserve"> External advisory (Perplexity) consulted on detection resistance strategy post-v0.12 Ernesthification. Advisory conclusion: Detection tools systematically over-flag technical/academic register regardless of actual prose variation. Ceiling for this work may be ~30% regardless of intervention depth. Strategic priority shifted: voice authenticity matters more than detector score. Problem: Five sections still opened with academic formula markers ("What advisory AI actually does goes well past...", "The second thing advisory AI does...", "When it works, the combined function looks like this:", "This essay was written using cognitive amplification..."). External advisory paragraph structured system-first rather than practice-first. Educator/organizer examples contained colon-list symmetry ("The X provides:") creating algorithmic pattern.</w:t>
+        <w:t xml:space="preserve"> External advisory (Perplexity) consulted on detection resistance strategy post-v0.12 Ernesthification. Advisory conclusion: Detection tools systematically over-flag technical/academic register regardless of actual prose variation. Ceiling for this work may be ~30% regardless of intervention depth. Strategic priority shifted: voice authenticity matters more than detector score. Problem: Five sections still opened with academic formula markers ("What advisory AI actually does goes well past...", "The second thing advisory AI does...", "When it works, the combined function looks like this:", "This essay was written using </w:t>
+      </w:r>
+      <w:r>
+        <w:lastRenderedPageBreak/>
+        <w:t>cognitive amplification..."). External advisory paragraph structured system-first rather than practice-first. Educator/organizer examples contained colon-list symmetry ("The X provides:") creating algorithmic pattern.</w:t>
       </w:r>
     </w:p>
     <w:p>
@@ -8491,6 +8519,7 @@
           <w:b/>
           <w:bCs/>
         </w:rPr>
+        <w:lastRenderedPageBreak/>
         <w:t>Advisory chain for this pass:</w:t>
       </w:r>
       <w:r>
@@ -8599,6 +8628,7 @@
         <w:pStyle w:val="ListNumber"/>
       </w:pPr>
       <w:r>
+        <w:lastRenderedPageBreak/>
         <w:t>Universal relatability shift: Moves CA from academic-only territory to "anyone who needs to express knowledge but lacks resources"</w:t>
       </w:r>
     </w:p>
@@ -8719,6 +8749,7 @@
         <w:pStyle w:val="ListNumber"/>
       </w:pPr>
       <w:r>
+        <w:lastRenderedPageBreak/>
         <w:t>Each entry explains substantive changes (detection-resistance, voice-authenticity, legal case integration, organizational structure)</w:t>
       </w:r>
     </w:p>
@@ -8894,6 +8925,7 @@
         <w:pStyle w:val="ListBullet"/>
       </w:pPr>
       <w:r>
+        <w:lastRenderedPageBreak/>
         <w:t>User feedback integration cycles: 12</w:t>
       </w:r>
     </w:p>
@@ -9040,6 +9072,7 @@
         <w:pStyle w:val="ListNumber"/>
       </w:pPr>
       <w:r>
+        <w:lastRenderedPageBreak/>
         <w:t>Scale and rigor constraint stated plainly: one researcher, no institution, no team, amplification required</w:t>
       </w:r>
     </w:p>
@@ -9226,6 +9259,7 @@
           <w:b/>
           <w:bCs/>
         </w:rPr>
+        <w:lastRenderedPageBreak/>
         <w:t>Major Changes Implemented in v0.15:</w:t>
       </w:r>
     </w:p>
@@ -9395,6 +9429,7 @@
           <w:b/>
           <w:bCs/>
         </w:rPr>
+        <w:lastRenderedPageBreak/>
         <w:t>Date:</w:t>
       </w:r>
       <w:r>
@@ -9543,6 +9578,7 @@
           <w:b/>
           <w:bCs/>
         </w:rPr>
+        <w:lastRenderedPageBreak/>
         <w:t>Result:</w:t>
       </w:r>
       <w:r>
@@ -9706,6 +9742,7 @@
           <w:b/>
           <w:bCs/>
         </w:rPr>
+        <w:lastRenderedPageBreak/>
         <w:t>v0.5 fork description corrected</w:t>
       </w:r>
       <w:r>
@@ -9917,6 +9954,7 @@
           <w:b/>
           <w:bCs/>
         </w:rPr>
+        <w:lastRenderedPageBreak/>
         <w:t>Research paper count:</w:t>
       </w:r>
       <w:r>
@@ -10086,7 +10124,11 @@
         <w:t>Research paper count updated to 45+</w:t>
       </w:r>
       <w:r>
-        <w:t xml:space="preserve"> in four locations: The Method ("produces 45+ research papers"), The Work as Evidence (Ernesthification reference, "consistent across 45+ papers"), Epilogue ("45+ papers. 50,000 documented conversation turns"), How This Was Made ("cross-referencing a 45+ paper corpus"). "80+ episodes" references left unchanged in The Grind, the legal case section, and The Work as Evidence.</w:t>
+        <w:t xml:space="preserve"> in four locations: The Method ("produces 45+ research papers"), The Work as Evidence (Ernesthification reference, "consistent across 45+ </w:t>
+      </w:r>
+      <w:r>
+        <w:lastRenderedPageBreak/>
+        <w:t>papers"), Epilogue ("45+ papers. 50,000 documented conversation turns"), How This Was Made ("cross-referencing a 45+ paper corpus"). "80+ episodes" references left unchanged in The Grind, the legal case section, and The Work as Evidence.</w:t>
       </w:r>
     </w:p>
     <w:p>
@@ -10259,6 +10301,7 @@
           <w:b/>
           <w:bCs/>
         </w:rPr>
+        <w:lastRenderedPageBreak/>
         <w:t>External advisory inputs:</w:t>
       </w:r>
       <w:r>
@@ -10446,6 +10489,7 @@
           <w:b/>
           <w:bCs/>
         </w:rPr>
+        <w:lastRenderedPageBreak/>
         <w:t>How This Was Made opened with label:</w:t>
       </w:r>
       <w:r>
@@ -10560,7 +10604,11 @@
         <w:t>Why the Work Is Yours reordered</w:t>
       </w:r>
       <w:r>
-        <w:t>: Removed "The anxiety is understandable" + "It's wrong" opening. Section now opens with Surface Compliance ownership claim as live demonstration: "No AI system decided that Surface Compliance was a real pattern worth naming. I did." Authorship definition follows as support for the demonstration already given. Demonstrate → define replaces define → defend.</w:t>
+        <w:t xml:space="preserve">: Removed "The anxiety is understandable" + "It's wrong" opening. Section now opens with Surface Compliance ownership claim as live demonstration: "No AI system decided that Surface Compliance was a real pattern worth naming. I did." Authorship </w:t>
+      </w:r>
+      <w:r>
+        <w:lastRenderedPageBreak/>
+        <w:t>definition follows as support for the demonstration already given. Demonstrate → define replaces define → defend.</w:t>
       </w:r>
     </w:p>
     <w:p>
@@ -10720,6 +10768,7 @@
           <w:b/>
           <w:bCs/>
         </w:rPr>
+        <w:lastRenderedPageBreak/>
         <w:t>Hollow Completions paragraph over-explained:</w:t>
       </w:r>
       <w:r>
@@ -10891,6 +10940,7 @@
           <w:b/>
           <w:bCs/>
         </w:rPr>
+        <w:lastRenderedPageBreak/>
         <w:t>Substantive content:</w:t>
       </w:r>
       <w:r>
@@ -11149,6 +11199,7 @@
         <w:pStyle w:val="Heading2"/>
       </w:pPr>
       <w:r>
+        <w:lastRenderedPageBreak/>
         <w:t>v1.4 Patch Log — 2026-03-30 (Post-Perplexity Critic Review)</w:t>
       </w:r>
     </w:p>
@@ -11458,7 +11509,11 @@
         <w:t>Added paragraph:</w:t>
       </w:r>
       <w:r>
-        <w:t xml:space="preserve"> "This framework was not built from the theoretical literature on human-computer interaction or cognitive extension. It was built from practice -- from 18 months of adversarial experience that preceded any engagement with that literature. I've since learned that others have arrived at adjacent positions from different starting points. That convergence is the evidence. The citation would be the performance."</w:t>
+        <w:t xml:space="preserve"> "This framework was not built from the theoretical literature on human-computer interaction or cognitive extension. It was built from practice -- from 18 months of adversarial experience </w:t>
+      </w:r>
+      <w:r>
+        <w:lastRenderedPageBreak/>
+        <w:t>that preceded any engagement with that literature. I've since learned that others have arrived at adjacent positions from different starting points. That convergence is the evidence. The citation would be the performance."</w:t>
       </w:r>
     </w:p>
     <w:p>
@@ -11643,6 +11698,7 @@
           <w:b/>
           <w:bCs/>
         </w:rPr>
+        <w:lastRenderedPageBreak/>
         <w:t>Two-layer amplification model</w:t>
       </w:r>
       <w:r>
@@ -11875,6 +11931,7 @@
         <w:pStyle w:val="ListBullet"/>
       </w:pPr>
       <w:r>
+        <w:lastRenderedPageBreak/>
         <w:t>Problem identified immediately: no stakes for uninitiated reader. User: "reads like a gripe fest and a pity party." File retained as archive; superseded by Epilogue architecture (below)</w:t>
       </w:r>
     </w:p>
@@ -12024,7 +12081,11 @@
         <w:t>Detection Problem Diagnosed:</w:t>
       </w:r>
       <w:r>
-        <w:t xml:space="preserve"> User: "the variation is too consistent. It's so consistent that even a human knows something weird is going on with this writing style." Diagnosis confirmed: Ernesthification was applying correct patterns with algorithmic consistency — every paragraph receiving confessional run → em-dash pivot → short punch at uniform cadence. Predictably patterned variation is itself an AI detection signal. Real human voice applies patterns erratically, not uniformly.</w:t>
+        <w:t xml:space="preserve"> User: "the variation is too consistent. It's so consistent that even a human knows something weird is going on with this writing style." Diagnosis confirmed: Ernesthification was applying correct patterns with algorithmic consistency — every paragraph receiving confessional run → em-dash pivot </w:t>
+      </w:r>
+      <w:r>
+        <w:lastRenderedPageBreak/>
+        <w:t>→ short punch at uniform cadence. Predictably patterned variation is itself an AI detection signal. Real human voice applies patterns erratically, not uniformly.</w:t>
       </w:r>
     </w:p>
     <w:p>
@@ -12191,6 +12252,7 @@
         <w:pStyle w:val="ListBullet"/>
       </w:pPr>
       <w:r>
+        <w:lastRenderedPageBreak/>
         <w:t>Phases A through I completed (standard FD structure); Code-Unlock issued after Phase I [internal session recovery note indicating approval to proceed]</w:t>
       </w:r>
     </w:p>
@@ -12355,6 +12417,7 @@
           <w:b/>
           <w:bCs/>
         </w:rPr>
+        <w:lastRenderedPageBreak/>
         <w:t>Version Header and Changelog Updated:</w:t>
       </w:r>
     </w:p>
@@ -12535,6 +12598,7 @@
         <w:pStyle w:val="Heading2"/>
       </w:pPr>
       <w:r>
+        <w:lastRenderedPageBreak/>
         <w:t>v1.5 — DOI Citation Additions (April 2026)</w:t>
       </w:r>
     </w:p>
@@ -12713,6 +12777,7 @@
           <w:b/>
           <w:bCs/>
         </w:rPr>
+        <w:lastRenderedPageBreak/>
         <w:t>v1.6 final session (2026-04-09):</w:t>
       </w:r>
       <w:r>
@@ -12988,6 +13053,7 @@
           </w:tcPr>
           <w:p>
             <w:r>
+              <w:lastRenderedPageBreak/>
               <w:t>Figure 4</w:t>
             </w:r>
           </w:p>

</xml_diff>